<commit_message>
docs: refine resume to one page with SimHei/SimSun fonts
</commit_message>
<xml_diff>
--- a/简历/张宇辰_求职简历_智能客服Agent.docx
+++ b/简历/张宇辰_求职简历_智能客服Agent.docx
@@ -9,22 +9,25 @@
       </w:pPr>
       <w:r>
         <w:rPr>
-          <w:rFonts w:ascii="微软雅黑" w:hAnsi="微软雅黑"/>
+          <w:rFonts w:eastAsia="黑体"/>
+          <w:rFonts w:ascii="黑体" w:hAnsi="黑体"/>
           <w:b/>
-          <w:sz w:val="44"/>
+          <w:sz w:val="40"/>
         </w:rPr>
         <w:t>张 宇 辰</w:t>
       </w:r>
     </w:p>
     <w:p>
       <w:pPr>
-        <w:spacing w:after="40"/>
+        <w:spacing w:after="20"/>
         <w:jc w:val="center"/>
       </w:pPr>
       <w:r>
         <w:rPr>
-          <w:rFonts w:ascii="微软雅黑" w:hAnsi="微软雅黑"/>
+          <w:rFonts w:eastAsia="宋体"/>
+          <w:rFonts w:ascii="宋体" w:hAnsi="宋体"/>
           <w:b w:val="0"/>
+          <w:color w:val="555555"/>
           <w:sz w:val="18"/>
         </w:rPr>
         <w:t>电话：138-xxxx-6789  |  邮箱：zhangyuchen@example.com  |  现居：广东省深圳市</w:t>
@@ -32,13 +35,15 @@
     </w:p>
     <w:p>
       <w:pPr>
-        <w:spacing w:after="40"/>
+        <w:spacing w:after="20"/>
         <w:jc w:val="center"/>
       </w:pPr>
       <w:r>
         <w:rPr>
-          <w:rFonts w:ascii="微软雅黑" w:hAnsi="微软雅黑"/>
+          <w:rFonts w:eastAsia="宋体"/>
+          <w:rFonts w:ascii="宋体" w:hAnsi="宋体"/>
           <w:b w:val="0"/>
+          <w:color w:val="555555"/>
           <w:sz w:val="18"/>
         </w:rPr>
         <w:t>江西财经大学 · 软件工程 · 本科（2027届）  |  GitHub：github.com/zhangyuchen</w:t>
@@ -46,488 +51,414 @@
     </w:p>
     <w:p>
       <w:pPr>
-        <w:spacing w:before="200" w:after="80"/>
+        <w:spacing w:before="160" w:after="40"/>
         <w:pBdr>
           <w:bottom w:val="single" w:sz="4" w:space="1" w:color="2E75B6"/>
         </w:pBdr>
       </w:pPr>
       <w:r>
         <w:rPr>
-          <w:rFonts w:ascii="微软雅黑" w:hAnsi="微软雅黑"/>
+          <w:rFonts w:eastAsia="黑体"/>
+          <w:rFonts w:ascii="黑体" w:hAnsi="黑体"/>
           <w:b/>
           <w:color w:val="2E75B6"/>
-          <w:sz w:val="26"/>
+          <w:sz w:val="24"/>
         </w:rPr>
         <w:t>求职意向</w:t>
       </w:r>
     </w:p>
     <w:p>
       <w:pPr>
-        <w:spacing w:after="40"/>
-        <w:ind w:left="283" w:hanging="170"/>
+        <w:spacing w:after="20"/>
+        <w:ind w:left="227" w:hanging="142"/>
       </w:pPr>
       <w:r>
         <w:rPr>
-          <w:rFonts w:ascii="微软雅黑" w:hAnsi="微软雅黑"/>
-          <w:sz w:val="20"/>
+          <w:rFonts w:eastAsia="宋体"/>
+          <w:rFonts w:ascii="宋体" w:hAnsi="宋体"/>
+          <w:b w:val="0"/>
+          <w:sz w:val="19"/>
         </w:rPr>
         <w:t>• 目标岗位：AI 应用开发 / 后端开发工程师（实习生）</w:t>
       </w:r>
     </w:p>
     <w:p>
       <w:pPr>
-        <w:spacing w:after="40"/>
-        <w:ind w:left="283" w:hanging="170"/>
+        <w:spacing w:after="20"/>
+        <w:ind w:left="227" w:hanging="142"/>
       </w:pPr>
       <w:r>
         <w:rPr>
-          <w:rFonts w:ascii="微软雅黑" w:hAnsi="微软雅黑"/>
-          <w:sz w:val="20"/>
+          <w:rFonts w:eastAsia="宋体"/>
+          <w:rFonts w:ascii="宋体" w:hAnsi="宋体"/>
+          <w:b w:val="0"/>
+          <w:sz w:val="19"/>
         </w:rPr>
-        <w:t>• 匹配优势：独立完成从需求分析到上线部署的全栈 AI 项目（智能客服 Agent），掌握 LangGraph + FastAPI + RAG 技术栈；代码结构清晰、文档完善、已部署上线；具备用 AI 工具高效构建生产级系统的能力。</w:t>
+        <w:t>• 独立完成从需求到上线的全栈 AI 项目（智能客服 Agent），掌握 LangGraph + FastAPI + RAG 技术栈；代码清晰、文档完善、已部署上线。</w:t>
       </w:r>
     </w:p>
     <w:p>
       <w:pPr>
-        <w:spacing w:before="200" w:after="80"/>
+        <w:spacing w:before="160" w:after="40"/>
         <w:pBdr>
           <w:bottom w:val="single" w:sz="4" w:space="1" w:color="2E75B6"/>
         </w:pBdr>
       </w:pPr>
       <w:r>
         <w:rPr>
-          <w:rFonts w:ascii="微软雅黑" w:hAnsi="微软雅黑"/>
+          <w:rFonts w:eastAsia="黑体"/>
+          <w:rFonts w:ascii="黑体" w:hAnsi="黑体"/>
           <w:b/>
           <w:color w:val="2E75B6"/>
-          <w:sz w:val="26"/>
+          <w:sz w:val="24"/>
         </w:rPr>
         <w:t>核心技能</w:t>
       </w:r>
     </w:p>
     <w:p>
       <w:pPr>
-        <w:spacing w:after="40"/>
-        <w:ind w:left="283" w:hanging="170"/>
+        <w:spacing w:after="20"/>
+        <w:ind w:left="227" w:hanging="142"/>
       </w:pPr>
       <w:r>
         <w:rPr>
-          <w:rFonts w:ascii="微软雅黑" w:hAnsi="微软雅黑"/>
-          <w:sz w:val="20"/>
+          <w:rFonts w:eastAsia="宋体"/>
+          <w:rFonts w:ascii="宋体" w:hAnsi="宋体"/>
+          <w:b w:val="0"/>
+          <w:sz w:val="19"/>
         </w:rPr>
-        <w:t>• AI Agent 开发：熟练掌握 LangGraph 多节点状态机设计（clarify → router → executor → respond → fallback），能够构建完整的 Agent 决策链路。</w:t>
+        <w:t>• AI Agent：熟练掌握 LangGraph 多节点状态机，构建 clarify → router → executor → respond → fallback 决策链路；理解 Function Calling 工具调用机制。</w:t>
       </w:r>
     </w:p>
     <w:p>
       <w:pPr>
-        <w:spacing w:after="40"/>
-        <w:ind w:left="283" w:hanging="170"/>
+        <w:spacing w:after="20"/>
+        <w:ind w:left="227" w:hanging="142"/>
       </w:pPr>
       <w:r>
         <w:rPr>
-          <w:rFonts w:ascii="微软雅黑" w:hAnsi="微软雅黑"/>
-          <w:sz w:val="20"/>
+          <w:rFonts w:eastAsia="宋体"/>
+          <w:rFonts w:ascii="宋体" w:hAnsi="宋体"/>
+          <w:b w:val="0"/>
+          <w:sz w:val="19"/>
         </w:rPr>
-        <w:t>• 大模型应用：深入理解 LLM Provider 抽象层设计，支持 DeepSeek / OpenAI / Claude / Qwen 多模型动态切换与按场景路由；掌握 Function Calling（工具调用）机制。</w:t>
+        <w:t>• LLM 应用：设计 Provider 抽象层，支持 DeepSeek / OpenAI / Claude / Qwen 多模型按场景动态切换（路由/澄清/回答/降级）；掌握 Prompt YAML 模板化管理。</w:t>
       </w:r>
     </w:p>
     <w:p>
       <w:pPr>
-        <w:spacing w:after="40"/>
-        <w:ind w:left="283" w:hanging="170"/>
+        <w:spacing w:after="20"/>
+        <w:ind w:left="227" w:hanging="142"/>
       </w:pPr>
       <w:r>
         <w:rPr>
-          <w:rFonts w:ascii="微软雅黑" w:hAnsi="微软雅黑"/>
-          <w:sz w:val="20"/>
+          <w:rFonts w:eastAsia="宋体"/>
+          <w:rFonts w:ascii="宋体" w:hAnsi="宋体"/>
+          <w:b w:val="0"/>
+          <w:sz w:val="19"/>
         </w:rPr>
-        <w:t>• RAG 检索增强生成：掌握 ChromaDB 向量存储 + BM25 关键词 + Cross-Encoder 重排的混合检索策略；熟悉知识库设计、FAQ 结构化与热更新流程。</w:t>
+        <w:t>• RAG &amp; 后端：ChromaDB + BM25 + Cross-Encoder 混合检索；FastAPI 全链路异步；熔断/重试/限流弹性机制；SQLite 持久化会话与 Token 感知上下文截断。</w:t>
       </w:r>
     </w:p>
     <w:p>
       <w:pPr>
-        <w:spacing w:after="40"/>
-        <w:ind w:left="283" w:hanging="170"/>
+        <w:spacing w:after="20"/>
+        <w:ind w:left="227" w:hanging="142"/>
       </w:pPr>
       <w:r>
         <w:rPr>
-          <w:rFonts w:ascii="微软雅黑" w:hAnsi="微软雅黑"/>
-          <w:sz w:val="20"/>
+          <w:rFonts w:eastAsia="宋体"/>
+          <w:rFonts w:ascii="宋体" w:hAnsi="宋体"/>
+          <w:b w:val="0"/>
+          <w:sz w:val="19"/>
         </w:rPr>
-        <w:t>• 后端工程能力：FastAPI 全链路异步开发、Pydantic 数据校验、structlog 结构化日志、中间件设计；SQLite 持久化会话管理；熔断/重试/限流等弹性机制。</w:t>
+        <w:t>• 工程部署：Docker + K8s 容器化；Render 公网上线；独立完成电商风格客服 UI（原生 HTML/CSS/JS）；VibeCoding 全流程 AI 辅助开发。</w:t>
       </w:r>
     </w:p>
     <w:p>
       <w:pPr>
-        <w:spacing w:after="40"/>
-        <w:ind w:left="283" w:hanging="170"/>
-      </w:pPr>
-      <w:r>
-        <w:rPr>
-          <w:rFonts w:ascii="微软雅黑" w:hAnsi="微软雅黑"/>
-          <w:sz w:val="20"/>
-        </w:rPr>
-        <w:t>• 前端与部署：独立完成电商风格客服聊天 UI（原生 HTML/CSS/JS）；Docker + K8s 容器化部署；Render 平台实际部署上线经验。</w:t>
-      </w:r>
-    </w:p>
-    <w:p>
-      <w:pPr>
-        <w:spacing w:after="40"/>
-        <w:ind w:left="283" w:hanging="170"/>
-      </w:pPr>
-      <w:r>
-        <w:rPr>
-          <w:rFonts w:ascii="微软雅黑" w:hAnsi="微软雅黑"/>
-          <w:sz w:val="20"/>
-        </w:rPr>
-        <w:t>• AI 辅助开发（VibeCoding）：熟练使用 Claude Code / ChatGPT 进行需求拆解、代码生成、Debug 与项目迭代，能在 AI 协作下高效完成从 0 到 1 的全流程开发。</w:t>
-      </w:r>
-    </w:p>
-    <w:p>
-      <w:pPr>
-        <w:spacing w:before="200" w:after="80"/>
+        <w:spacing w:before="160" w:after="40"/>
         <w:pBdr>
           <w:bottom w:val="single" w:sz="4" w:space="1" w:color="2E75B6"/>
         </w:pBdr>
       </w:pPr>
       <w:r>
         <w:rPr>
-          <w:rFonts w:ascii="微软雅黑" w:hAnsi="微软雅黑"/>
+          <w:rFonts w:eastAsia="黑体"/>
+          <w:rFonts w:ascii="黑体" w:hAnsi="黑体"/>
           <w:b/>
           <w:color w:val="2E75B6"/>
-          <w:sz w:val="26"/>
+          <w:sz w:val="24"/>
         </w:rPr>
         <w:t>核心项目经历</w:t>
       </w:r>
     </w:p>
     <w:p>
       <w:pPr>
-        <w:spacing w:before="120" w:after="40"/>
+        <w:spacing w:before="80" w:after="20"/>
       </w:pPr>
       <w:r>
         <w:rPr>
-          <w:rFonts w:ascii="微软雅黑" w:hAnsi="微软雅黑"/>
+          <w:rFonts w:eastAsia="黑体"/>
+          <w:rFonts w:ascii="黑体" w:hAnsi="黑体"/>
           <w:b/>
-          <w:sz w:val="22"/>
+          <w:sz w:val="20"/>
         </w:rPr>
         <w:t>SCS-Agent — 智能客服 Agent 系统（全栈独立开发）</w:t>
       </w:r>
     </w:p>
     <w:p>
       <w:pPr>
-        <w:spacing w:after="40"/>
+        <w:spacing w:after="20"/>
       </w:pPr>
       <w:r>
         <w:rPr>
-          <w:rFonts w:ascii="微软雅黑" w:hAnsi="微软雅黑"/>
+          <w:rFonts w:eastAsia="宋体"/>
+          <w:rFonts w:ascii="宋体" w:hAnsi="宋体"/>
+          <w:b w:val="0"/>
           <w:color w:val="555555"/>
-          <w:sz w:val="20"/>
+          <w:sz w:val="18"/>
         </w:rPr>
-        <w:t>项目角色：全栈开发 / 架构设计 / 部署运维  |  技术栈：Python, LangGraph, FastAPI, ChromaDB, DeepSeek API, SQLite, Docker</w:t>
+        <w:t>技术栈：Python, LangGraph, FastAPI, ChromaDB, DeepSeek API, SQLite, Docker  |  GitHub 开源 95+ 文件，已部署上线</w:t>
       </w:r>
     </w:p>
     <w:p>
       <w:pPr>
-        <w:spacing w:after="40"/>
-        <w:ind w:left="283" w:hanging="170"/>
+        <w:spacing w:after="20"/>
+        <w:ind w:left="227" w:hanging="142"/>
       </w:pPr>
       <w:r>
         <w:rPr>
-          <w:rFonts w:ascii="微软雅黑" w:hAnsi="微软雅黑"/>
-          <w:sz w:val="20"/>
+          <w:rFonts w:eastAsia="宋体"/>
+          <w:rFonts w:ascii="宋体" w:hAnsi="宋体"/>
+          <w:b w:val="0"/>
+          <w:sz w:val="19"/>
         </w:rPr>
-        <w:t>• 项目概述：从零构建面向真实业务场景的生产级智能客服系统，支持多轮对话、工具调用、RAG 知识库、历史会话管理。已部署上线供公网访问。</w:t>
+        <w:t>• 设计 LangGraph 五节点状态机，实现模糊输入反问澄清、关键词+RAG+LLM 三层路由、工具调用循环执行、失败自动降级的完整 Agent 链路。</w:t>
       </w:r>
     </w:p>
     <w:p>
       <w:pPr>
-        <w:spacing w:after="40"/>
-        <w:ind w:left="283" w:hanging="170"/>
+        <w:spacing w:after="20"/>
+        <w:ind w:left="227" w:hanging="142"/>
       </w:pPr>
       <w:r>
         <w:rPr>
-          <w:rFonts w:ascii="微软雅黑" w:hAnsi="微软雅黑"/>
-          <w:sz w:val="20"/>
+          <w:rFonts w:eastAsia="宋体"/>
+          <w:rFonts w:ascii="宋体" w:hAnsi="宋体"/>
+          <w:b w:val="0"/>
+          <w:sz w:val="19"/>
         </w:rPr>
-        <w:t>• LangGraph 状态机设计：设计 clarify → router → executor → respond → fallback 五节点状态流转图，实现模糊输入反问澄清、三层路由（关键词+RAG+LLM）精准匹配业务域、工具调用循环执行、失败自动降级。</w:t>
+        <w:t>• 封装多模型 Provider 抽象层，通过 YAML 配置驱动按场景切换模型；设计装饰器式 ToolRegistry，注册 FAQ 检索、订单查询等 6 个可扩展工具。</w:t>
       </w:r>
     </w:p>
     <w:p>
       <w:pPr>
-        <w:spacing w:after="40"/>
-        <w:ind w:left="283" w:hanging="170"/>
+        <w:spacing w:after="20"/>
+        <w:ind w:left="227" w:hanging="142"/>
       </w:pPr>
       <w:r>
         <w:rPr>
-          <w:rFonts w:ascii="微软雅黑" w:hAnsi="微软雅黑"/>
-          <w:sz w:val="20"/>
+          <w:rFonts w:eastAsia="宋体"/>
+          <w:rFonts w:ascii="宋体" w:hAnsi="宋体"/>
+          <w:b w:val="0"/>
+          <w:sz w:val="19"/>
         </w:rPr>
-        <w:t>• LLM Provider 抽象层：封装 OpenAI / Claude / Qwen 三个 Provider，统一 chat() 与 chat_with_tools() 接口，通过 YAML 配置实现按场景（路由/澄清/回答/降级）动态切换模型。</w:t>
+        <w:t>• 构建 4 业务域×40 条 FAQ 知识库 + 12 条真实物流数据库，实现 ChromaDB 向量 + BM25 关键词 + Cross-Encoder 重排的混合检索。</w:t>
       </w:r>
     </w:p>
     <w:p>
       <w:pPr>
-        <w:spacing w:after="40"/>
-        <w:ind w:left="283" w:hanging="170"/>
+        <w:spacing w:after="20"/>
+        <w:ind w:left="227" w:hanging="142"/>
       </w:pPr>
       <w:r>
         <w:rPr>
-          <w:rFonts w:ascii="微软雅黑" w:hAnsi="微软雅黑"/>
-          <w:sz w:val="20"/>
+          <w:rFonts w:eastAsia="宋体"/>
+          <w:rFonts w:ascii="宋体" w:hAnsi="宋体"/>
+          <w:b w:val="0"/>
+          <w:sz w:val="19"/>
         </w:rPr>
-        <w:t>• RAG 知识库系统：设计 4 个业务域×40 条 FAQ 的知识体系，实现 ChromaDB 向量语义检索 + BM25 关键词检索 + Cross-Encoder 重排的混合检索策略，支持业务域过滤与知识热更新。</w:t>
+        <w:t>• 实现分布式熔断器、指数退避重试、令牌桶限流；SQLite 持久化历史会话，支持对话恢复与 3000 Token 感知上下文截断；38 个单元测试全部通过。</w:t>
       </w:r>
     </w:p>
     <w:p>
       <w:pPr>
-        <w:spacing w:after="40"/>
-        <w:ind w:left="283" w:hanging="170"/>
+        <w:spacing w:after="20"/>
+        <w:ind w:left="227" w:hanging="142"/>
       </w:pPr>
       <w:r>
         <w:rPr>
-          <w:rFonts w:ascii="微软雅黑" w:hAnsi="微软雅黑"/>
-          <w:sz w:val="20"/>
+          <w:rFonts w:eastAsia="宋体"/>
+          <w:rFonts w:ascii="宋体" w:hAnsi="宋体"/>
+          <w:b w:val="0"/>
+          <w:sz w:val="19"/>
         </w:rPr>
-        <w:t>• 工具注册与调用：设计装饰器式 ToolRegistry，注册 FAQ 检索、订单查询、账户查询、工单创建、人工转接、政策检索 6 个可扩展工具；内置 12 条真实物流数据的数据库，支持按订单号/手机号/关键词多维度查询。</w:t>
+        <w:t>• 独立完成淘宝风格客服前端界面（历史会话侧边栏、快捷回复卡片、格式化消息渲染）；部署至 Render 公网可访问。</w:t>
       </w:r>
     </w:p>
     <w:p>
       <w:pPr>
-        <w:spacing w:after="40"/>
-        <w:ind w:left="283" w:hanging="170"/>
-      </w:pPr>
-      <w:r>
-        <w:rPr>
-          <w:rFonts w:ascii="微软雅黑" w:hAnsi="微软雅黑"/>
-          <w:sz w:val="20"/>
-        </w:rPr>
-        <w:t>• 工程化与弹性设计：实现分布式熔断器（三态状态机）、指数退避重试、令牌桶限流；YAML 模板化 Prompt 管理 + 版本控制；SQLite 持久化会话存储，支持历史对话恢复与 Token 感知的上下文截断。</w:t>
-      </w:r>
-    </w:p>
-    <w:p>
-      <w:pPr>
-        <w:spacing w:after="40"/>
-        <w:ind w:left="283" w:hanging="170"/>
-      </w:pPr>
-      <w:r>
-        <w:rPr>
-          <w:rFonts w:ascii="微软雅黑" w:hAnsi="微软雅黑"/>
-          <w:sz w:val="20"/>
-        </w:rPr>
-        <w:t>• 前端与部署：淘宝/天猫风格电商客服 UI，支持历史会话侧边栏、快捷回复卡片、格式化消息渲染；Render 平台公网上线，在线体验地址已写入项目 README。</w:t>
-      </w:r>
-    </w:p>
-    <w:p>
-      <w:pPr>
-        <w:spacing w:after="40"/>
-        <w:ind w:left="283" w:hanging="170"/>
-      </w:pPr>
-      <w:r>
-        <w:rPr>
-          <w:rFonts w:ascii="微软雅黑" w:hAnsi="微软雅黑"/>
-          <w:sz w:val="20"/>
-        </w:rPr>
-        <w:t>• 成果：GitHub 开源（95+ 文件），38 个单元测试全部通过，已实际部署上线。</w:t>
-      </w:r>
-    </w:p>
-    <w:p>
-      <w:pPr>
-        <w:spacing w:before="200" w:after="80"/>
+        <w:spacing w:before="160" w:after="40"/>
         <w:pBdr>
           <w:bottom w:val="single" w:sz="4" w:space="1" w:color="2E75B6"/>
         </w:pBdr>
       </w:pPr>
       <w:r>
         <w:rPr>
-          <w:rFonts w:ascii="微软雅黑" w:hAnsi="微软雅黑"/>
+          <w:rFonts w:eastAsia="黑体"/>
+          <w:rFonts w:ascii="黑体" w:hAnsi="黑体"/>
           <w:b/>
           <w:color w:val="2E75B6"/>
-          <w:sz w:val="26"/>
+          <w:sz w:val="24"/>
         </w:rPr>
         <w:t>教育背景</w:t>
       </w:r>
     </w:p>
     <w:p>
       <w:pPr>
-        <w:spacing w:after="40"/>
-        <w:jc w:val="left"/>
+        <w:spacing w:after="20"/>
       </w:pPr>
       <w:r>
         <w:rPr>
-          <w:rFonts w:ascii="微软雅黑" w:hAnsi="微软雅黑"/>
+          <w:rFonts w:eastAsia="宋体"/>
+          <w:rFonts w:ascii="宋体" w:hAnsi="宋体"/>
           <w:b w:val="0"/>
-          <w:sz w:val="21"/>
+          <w:color w:val="555555"/>
+          <w:sz w:val="18"/>
         </w:rPr>
-        <w:t>江西财经大学  |  软件工程  |  本科（2023.09 - 2027.07 ）</w:t>
+        <w:t>江西财经大学  |  软件工程  |  本科（2023.09 - 2027.07）</w:t>
       </w:r>
     </w:p>
     <w:p>
       <w:pPr>
-        <w:spacing w:after="40"/>
-        <w:ind w:left="283" w:hanging="170"/>
+        <w:spacing w:after="20"/>
+        <w:ind w:left="227" w:hanging="142"/>
       </w:pPr>
       <w:r>
         <w:rPr>
-          <w:rFonts w:ascii="微软雅黑" w:hAnsi="微软雅黑"/>
-          <w:sz w:val="20"/>
+          <w:rFonts w:eastAsia="宋体"/>
+          <w:rFonts w:ascii="宋体" w:hAnsi="宋体"/>
+          <w:b w:val="0"/>
+          <w:sz w:val="19"/>
         </w:rPr>
-        <w:t>• 主修课程：软件工程、计算机网络、数据结构、计算机组成原理、操作系统（覆盖408考纲），具备扎实计算机底层逻辑与系统工程基础。</w:t>
+        <w:t>• 主修：软件工程、数据结构、计算机网络、操作系统、计算机组成原理（408 考纲全覆盖），具备扎实计算机基础与系统工程思维。</w:t>
       </w:r>
     </w:p>
     <w:p>
       <w:pPr>
-        <w:spacing w:after="40"/>
-        <w:ind w:left="283" w:hanging="170"/>
-      </w:pPr>
-      <w:r>
-        <w:rPr>
-          <w:rFonts w:ascii="微软雅黑" w:hAnsi="微软雅黑"/>
-          <w:sz w:val="20"/>
-        </w:rPr>
-        <w:t>• 复合优势：依托财经类院校背景，在严谨工科思维外，具备一定商业敏感度与业务理解潜力。</w:t>
-      </w:r>
-    </w:p>
-    <w:p>
-      <w:pPr>
-        <w:spacing w:before="200" w:after="80"/>
+        <w:spacing w:before="160" w:after="40"/>
         <w:pBdr>
           <w:bottom w:val="single" w:sz="4" w:space="1" w:color="2E75B6"/>
         </w:pBdr>
       </w:pPr>
       <w:r>
         <w:rPr>
-          <w:rFonts w:ascii="微软雅黑" w:hAnsi="微软雅黑"/>
+          <w:rFonts w:eastAsia="黑体"/>
+          <w:rFonts w:ascii="黑体" w:hAnsi="黑体"/>
           <w:b/>
           <w:color w:val="2E75B6"/>
-          <w:sz w:val="26"/>
+          <w:sz w:val="24"/>
         </w:rPr>
         <w:t>校园经历</w:t>
       </w:r>
     </w:p>
     <w:p>
       <w:pPr>
-        <w:spacing w:after="40"/>
-        <w:jc w:val="left"/>
+        <w:spacing w:after="20"/>
       </w:pPr>
       <w:r>
         <w:rPr>
-          <w:rFonts w:ascii="微软雅黑" w:hAnsi="微软雅黑"/>
+          <w:rFonts w:eastAsia="宋体"/>
+          <w:rFonts w:ascii="宋体" w:hAnsi="宋体"/>
           <w:b w:val="0"/>
-          <w:sz w:val="21"/>
+          <w:color w:val="555555"/>
+          <w:sz w:val="18"/>
         </w:rPr>
-        <w:t>校学生会 · 组织部  |  干事（2023.09 - 2024.06）</w:t>
+        <w:t>校学生会组织部 · 干事（2023.09 - 2024.06）</w:t>
       </w:r>
     </w:p>
     <w:p>
       <w:pPr>
-        <w:spacing w:after="40"/>
-        <w:ind w:left="283" w:hanging="170"/>
+        <w:spacing w:after="20"/>
+        <w:ind w:left="227" w:hanging="142"/>
       </w:pPr>
       <w:r>
         <w:rPr>
-          <w:rFonts w:ascii="微软雅黑" w:hAnsi="微软雅黑"/>
-          <w:sz w:val="20"/>
+          <w:rFonts w:eastAsia="宋体"/>
+          <w:rFonts w:ascii="宋体" w:hAnsi="宋体"/>
+          <w:b w:val="0"/>
+          <w:sz w:val="19"/>
         </w:rPr>
-        <w:t>• 跨部门信息统筹：负责全院多个年级党团关系摸底排查，建立"通知下发-进度催收-初步审核"跟进机制，确保信息收集按时零遗漏闭环。</w:t>
+        <w:t>• 统筹全院党团关系排查，建立"通知下发-进度催收-审核归档"跟进机制，确保信息收集零遗漏；负责数据规范化整理与跨层级沟通答疑。</w:t>
       </w:r>
     </w:p>
     <w:p>
       <w:pPr>
-        <w:spacing w:after="40"/>
-        <w:ind w:left="283" w:hanging="170"/>
-      </w:pPr>
-      <w:r>
-        <w:rPr>
-          <w:rFonts w:ascii="微软雅黑" w:hAnsi="微软雅黑"/>
-          <w:sz w:val="20"/>
-        </w:rPr>
-        <w:t>• 数据整理与归档：将庞杂原始数据规范化处理，利用基础办公软件进行信息登记、分类汇总与排版，确保归档材料条理清晰、方便调阅。</w:t>
-      </w:r>
-    </w:p>
-    <w:p>
-      <w:pPr>
-        <w:spacing w:after="40"/>
-        <w:ind w:left="283" w:hanging="170"/>
-      </w:pPr>
-      <w:r>
-        <w:rPr>
-          <w:rFonts w:ascii="微软雅黑" w:hAnsi="微软雅黑"/>
-          <w:sz w:val="20"/>
-        </w:rPr>
-        <w:t>• 沟通与答疑：针对各班团支书对填报要求的疑问，提供耐心清晰的解答与指导，锻炼了跨层级沟通与问题拆解能力。</w:t>
-      </w:r>
-    </w:p>
-    <w:p>
-      <w:pPr>
-        <w:spacing w:before="200" w:after="80"/>
+        <w:spacing w:before="160" w:after="40"/>
         <w:pBdr>
           <w:bottom w:val="single" w:sz="4" w:space="1" w:color="2E75B6"/>
         </w:pBdr>
       </w:pPr>
       <w:r>
         <w:rPr>
-          <w:rFonts w:ascii="微软雅黑" w:hAnsi="微软雅黑"/>
+          <w:rFonts w:eastAsia="黑体"/>
+          <w:rFonts w:ascii="黑体" w:hAnsi="黑体"/>
           <w:b/>
           <w:color w:val="2E75B6"/>
-          <w:sz w:val="26"/>
+          <w:sz w:val="24"/>
         </w:rPr>
         <w:t>自我评价</w:t>
       </w:r>
     </w:p>
     <w:p>
       <w:pPr>
-        <w:spacing w:after="40"/>
-        <w:ind w:left="283" w:hanging="170"/>
+        <w:spacing w:after="20"/>
+        <w:ind w:left="227" w:hanging="142"/>
       </w:pPr>
       <w:r>
         <w:rPr>
-          <w:rFonts w:ascii="微软雅黑" w:hAnsi="微软雅黑"/>
-          <w:sz w:val="20"/>
+          <w:rFonts w:eastAsia="宋体"/>
+          <w:rFonts w:ascii="宋体" w:hAnsi="宋体"/>
+          <w:b w:val="0"/>
+          <w:sz w:val="19"/>
         </w:rPr>
-        <w:t>• 动手能力强，成果导向：独立完成从需求分析、架构设计、编码实现到部署上线的全流程。不仅写出能跑的代码，更注重代码质量、错误处理、日志追踪等工程细节。</w:t>
+        <w:t>• 动手能力强、成果导向：独立完成从需求分析到部署上线的全流程，注重代码质量、错误处理与工程文档。</w:t>
       </w:r>
     </w:p>
     <w:p>
       <w:pPr>
-        <w:spacing w:after="40"/>
-        <w:ind w:left="283" w:hanging="170"/>
+        <w:spacing w:after="20"/>
+        <w:ind w:left="227" w:hanging="142"/>
       </w:pPr>
       <w:r>
         <w:rPr>
-          <w:rFonts w:ascii="微软雅黑" w:hAnsi="微软雅黑"/>
-          <w:sz w:val="20"/>
+          <w:rFonts w:eastAsia="宋体"/>
+          <w:rFonts w:ascii="宋体" w:hAnsi="宋体"/>
+          <w:b w:val="0"/>
+          <w:sz w:val="19"/>
         </w:rPr>
-        <w:t>• 拥抱 AI，善于借力：通过 Claude Code 等 AI 工具大幅提升开发效率。将复杂需求拆解为 AI 可执行的具体任务，在 AI 协作中扮演"架构师+项目经理"角色。</w:t>
+        <w:t>• 拥抱 AI、高效协作：熟练使用 Claude Code 等 AI 工具将复杂需求拆解为可执行任务，在 AI 协作中扮演"架构师+执行者"角色。</w:t>
       </w:r>
     </w:p>
     <w:p>
       <w:pPr>
-        <w:spacing w:after="40"/>
-        <w:ind w:left="283" w:hanging="170"/>
+        <w:spacing w:after="20"/>
+        <w:ind w:left="227" w:hanging="142"/>
       </w:pPr>
       <w:r>
         <w:rPr>
-          <w:rFonts w:ascii="微软雅黑" w:hAnsi="微软雅黑"/>
-          <w:sz w:val="20"/>
+          <w:rFonts w:eastAsia="宋体"/>
+          <w:rFonts w:ascii="宋体" w:hAnsi="宋体"/>
+          <w:b w:val="0"/>
+          <w:sz w:val="19"/>
         </w:rPr>
-        <w:t>• 全栈视野，沟通无障碍：既理解 Agent 状态机、RAG 等技术原理，也能从用户体验角度设计交互界面。能作为技术与业务之间的"翻译桥梁"。</w:t>
-      </w:r>
-    </w:p>
-    <w:p>
-      <w:pPr>
-        <w:spacing w:after="40"/>
-        <w:ind w:left="283" w:hanging="170"/>
-      </w:pPr>
-      <w:r>
-        <w:rPr>
-          <w:rFonts w:ascii="微软雅黑" w:hAnsi="微软雅黑"/>
-          <w:sz w:val="20"/>
-        </w:rPr>
-        <w:t>• 踏实务实，持续学习：项目代码 95+ 文件、38 个测试用例、完整 README 文档，体现良好的工程习惯与职业素养。对 AI 领域保持高度热情，持续跟进前沿技术。</w:t>
+        <w:t>• 全栈视野、沟通无碍：既理解 Agent / RAG 等技术原理，也能从用户角度设计交互界面，适合做技术与业务间的桥梁。</w:t>
       </w:r>
     </w:p>
     <w:sectPr>
       <w:pgSz w:w="11906" w:h="16838"/>
-      <w:pgMar w:top="850" w:right="1020" w:bottom="850" w:left="1020" w:header="720" w:footer="720" w:gutter="0"/>
+      <w:pgMar w:top="680" w:right="850" w:bottom="567" w:left="850" w:header="720" w:footer="720" w:gutter="0"/>
       <w:cols w:space="720"/>
       <w:docGrid w:linePitch="360"/>
     </w:sectPr>
@@ -899,11 +830,12 @@
     <w:qFormat/>
     <w:rsid w:val="00FC693F"/>
     <w:pPr>
-      <w:spacing w:after="0" w:before="0" w:line="324" w:lineRule="auto"/>
+      <w:spacing w:after="0" w:before="0" w:line="300" w:lineRule="auto"/>
     </w:pPr>
     <w:rPr>
-      <w:rFonts w:ascii="微软雅黑" w:hAnsi="微软雅黑"/>
-      <w:sz w:val="21"/>
+      <w:rFonts w:eastAsia="宋体"/>
+      <w:rFonts w:ascii="宋体" w:hAnsi="宋体"/>
+      <w:sz w:val="20"/>
     </w:rPr>
   </w:style>
   <w:style w:type="paragraph" w:styleId="Header">

</xml_diff>

<commit_message>
docs: simplify skills section, add C++ basics
</commit_message>
<xml_diff>
--- a/简历/张宇辰_求职简历_智能客服Agent.docx
+++ b/简历/张宇辰_求职简历_智能客服Agent.docx
@@ -127,7 +127,7 @@
           <w:b w:val="0"/>
           <w:sz w:val="19"/>
         </w:rPr>
-        <w:t>• AI Agent：熟练掌握 LangGraph 多节点状态机，构建 clarify → router → executor → respond → fallback 决策链路；理解 Function Calling 工具调用机制。</w:t>
+        <w:t>• 编程语言：掌握 C++ 基础（语法、STL、面向对象），了解 Python 基本使用。</w:t>
       </w:r>
     </w:p>
     <w:p>
@@ -142,7 +142,7 @@
           <w:b w:val="0"/>
           <w:sz w:val="19"/>
         </w:rPr>
-        <w:t>• LLM 应用：设计 Provider 抽象层，支持 DeepSeek / OpenAI / Claude / Qwen 多模型按场景动态切换（路由/澄清/回答/降级）；掌握 Prompt YAML 模板化管理。</w:t>
+        <w:t>• AI 应用：了解 LangChain / LangGraph 框架基础概念，理解 Agent 多节点状态机工作流程。</w:t>
       </w:r>
     </w:p>
     <w:p>
@@ -157,7 +157,7 @@
           <w:b w:val="0"/>
           <w:sz w:val="19"/>
         </w:rPr>
-        <w:t>• RAG &amp; 后端：ChromaDB + BM25 + Cross-Encoder 混合检索；FastAPI 全链路异步；熔断/重试/限流弹性机制；SQLite 持久化会话与 Token 感知上下文截断。</w:t>
+        <w:t>• RAG 检索增强生成：了解向量数据库（ChromaDB）基本使用、FAQ 知识库构建与混合检索（向量 + 关键词）基础流程。</w:t>
       </w:r>
     </w:p>
     <w:p>
@@ -172,7 +172,7 @@
           <w:b w:val="0"/>
           <w:sz w:val="19"/>
         </w:rPr>
-        <w:t>• 工程部署：Docker + K8s 容器化；Render 公网上线；独立完成电商风格客服 UI（原生 HTML/CSS/JS）；VibeCoding 全流程 AI 辅助开发。</w:t>
+        <w:t>• 工具与部署：了解 FastAPI 基础、Git 版本控制、Docker 容器化部署；熟练使用 Claude Code 等 AI 工具进行辅助开发。</w:t>
       </w:r>
     </w:p>
     <w:p>

</xml_diff>

<commit_message>
docs: simplify project experience, emphasize VibeCoding
</commit_message>
<xml_diff>
--- a/简历/张宇辰_求职简历_智能客服Agent.docx
+++ b/简历/张宇辰_求职简历_智能客服Agent.docx
@@ -94,7 +94,7 @@
           <w:b w:val="0"/>
           <w:sz w:val="19"/>
         </w:rPr>
-        <w:t>• 独立完成从需求到上线的全栈 AI 项目（智能客服 Agent），掌握 LangGraph + FastAPI + RAG 技术栈；代码清晰、文档完善、已部署上线。</w:t>
+        <w:t>• 独立完成从需求到上线的 AI 项目（智能客服 Agent），全程使用 VibeCoding（Claude Code）辅助开发，了解 LangGraph + FastAPI + RAG 基础技术栈。</w:t>
       </w:r>
     </w:p>
     <w:p>
@@ -204,7 +204,7 @@
           <w:b/>
           <w:sz w:val="20"/>
         </w:rPr>
-        <w:t>SCS-Agent — 智能客服 Agent 系统（全栈独立开发）</w:t>
+        <w:t>SCS-Agent — 智能客服 Agent 系统（VibeCoding 实践）</w:t>
       </w:r>
     </w:p>
     <w:p>
@@ -219,7 +219,7 @@
           <w:color w:val="555555"/>
           <w:sz w:val="18"/>
         </w:rPr>
-        <w:t>技术栈：Python, LangGraph, FastAPI, ChromaDB, DeepSeek API, SQLite, Docker  |  GitHub 开源 95+ 文件，已部署上线</w:t>
+        <w:t>技术栈：Python, LangGraph, FastAPI, ChromaDB, DeepSeek API  |  GitHub 开源，已部署上线</w:t>
       </w:r>
     </w:p>
     <w:p>
@@ -234,7 +234,7 @@
           <w:b w:val="0"/>
           <w:sz w:val="19"/>
         </w:rPr>
-        <w:t>• 设计 LangGraph 五节点状态机，实现模糊输入反问澄清、关键词+RAG+LLM 三层路由、工具调用循环执行、失败自动降级的完整 Agent 链路。</w:t>
+        <w:t>• 使用 Claude Code 进行 VibeCoding 辅助开发，通过自然语言描述需求、拆解任务，由 AI 协助完成代码生成与调试，完成从 0 到 1 的项目构建。</w:t>
       </w:r>
     </w:p>
     <w:p>
@@ -249,7 +249,7 @@
           <w:b w:val="0"/>
           <w:sz w:val="19"/>
         </w:rPr>
-        <w:t>• 封装多模型 Provider 抽象层，通过 YAML 配置驱动按场景切换模型；设计装饰器式 ToolRegistry，注册 FAQ 检索、订单查询等 6 个可扩展工具。</w:t>
+        <w:t>• 基于 LangGraph 搭建多节点 Agent 状态机（澄清 → 路由 → 检索执行 → 回复 → 降级），实现多轮对话、反问澄清与工具调用。</w:t>
       </w:r>
     </w:p>
     <w:p>
@@ -264,7 +264,7 @@
           <w:b w:val="0"/>
           <w:sz w:val="19"/>
         </w:rPr>
-        <w:t>• 构建 4 业务域×40 条 FAQ 知识库 + 12 条真实物流数据库，实现 ChromaDB 向量 + BM25 关键词 + Cross-Encoder 重排的混合检索。</w:t>
+        <w:t>• 构建 FAQ 知识库（4 个业务域 × 40 条问答）与物流信息数据库（12 条记录），实现基础的 RAG 检索问答功能。</w:t>
       </w:r>
     </w:p>
     <w:p>
@@ -279,22 +279,7 @@
           <w:b w:val="0"/>
           <w:sz w:val="19"/>
         </w:rPr>
-        <w:t>• 实现分布式熔断器、指数退避重试、令牌桶限流；SQLite 持久化历史会话，支持对话恢复与 3000 Token 感知上下文截断；38 个单元测试全部通过。</w:t>
-      </w:r>
-    </w:p>
-    <w:p>
-      <w:pPr>
-        <w:spacing w:after="20"/>
-        <w:ind w:left="227" w:hanging="142"/>
-      </w:pPr>
-      <w:r>
-        <w:rPr>
-          <w:rFonts w:eastAsia="宋体"/>
-          <w:rFonts w:ascii="宋体" w:hAnsi="宋体"/>
-          <w:b w:val="0"/>
-          <w:sz w:val="19"/>
-        </w:rPr>
-        <w:t>• 独立完成淘宝风格客服前端界面（历史会话侧边栏、快捷回复卡片、格式化消息渲染）；部署至 Render 公网可访问。</w:t>
+        <w:t>• 设计电商风格聊天前端界面，支持历史会话管理与上下文记忆；部署至 Render 平台实现公网访问。</w:t>
       </w:r>
     </w:p>
     <w:p>
@@ -423,7 +408,7 @@
           <w:b w:val="0"/>
           <w:sz w:val="19"/>
         </w:rPr>
-        <w:t>• 动手能力强、成果导向：独立完成从需求分析到部署上线的全流程，注重代码质量、错误处理与工程文档。</w:t>
+        <w:t>• 善于利用 AI 工具（Claude Code）进行 VibeCoding，能将想法快速转化为可运行的产品原型，注重实践与快速落地。</w:t>
       </w:r>
     </w:p>
     <w:p>
@@ -438,7 +423,7 @@
           <w:b w:val="0"/>
           <w:sz w:val="19"/>
         </w:rPr>
-        <w:t>• 拥抱 AI、高效协作：熟练使用 Claude Code 等 AI 工具将复杂需求拆解为可执行任务，在 AI 协作中扮演"架构师+执行者"角色。</w:t>
+        <w:t>• 有从 0 到 1 完成项目的经验，具备基本的需求拆解、代码组织与文档撰写能力，做事踏实、不浮躁。</w:t>
       </w:r>
     </w:p>
     <w:p>
@@ -453,7 +438,7 @@
           <w:b w:val="0"/>
           <w:sz w:val="19"/>
         </w:rPr>
-        <w:t>• 全栈视野、沟通无碍：既理解 Agent / RAG 等技术原理，也能从用户角度设计交互界面，适合做技术与业务间的桥梁。</w:t>
+        <w:t>• 对 AI / LLM 领域有浓厚兴趣，持续关注行业动态，愿意在实际工作中深入学习与成长。</w:t>
       </w:r>
     </w:p>
     <w:sectPr>

</xml_diff>

<commit_message>
docs: add LangChain and context memory to project experience
</commit_message>
<xml_diff>
--- a/简历/张宇辰_求职简历_智能客服Agent.docx
+++ b/简历/张宇辰_求职简历_智能客服Agent.docx
@@ -249,7 +249,7 @@
           <w:b w:val="0"/>
           <w:sz w:val="19"/>
         </w:rPr>
-        <w:t>• 基于 LangGraph 搭建多节点 Agent 状态机（澄清 → 路由 → 检索执行 → 回复 → 降级），实现多轮对话、反问澄清与工具调用。</w:t>
+        <w:t>• 基于 LangChain / LangGraph 框架搭建多节点 Agent 状态机（澄清 → 路由 → 检索执行 → 回复 → 降级），实现多轮对话、反问澄清与工具调用。</w:t>
       </w:r>
     </w:p>
     <w:p>
@@ -279,7 +279,22 @@
           <w:b w:val="0"/>
           <w:sz w:val="19"/>
         </w:rPr>
-        <w:t>• 设计电商风格聊天前端界面，支持历史会话管理与上下文记忆；部署至 Render 平台实现公网访问。</w:t>
+        <w:t>• 设计电商风格聊天前端界面，通过 SQLite 持久化存储实现历史会话管理与上下文记忆，支持对话恢复与 Token 感知的上下文截断。</w:t>
+      </w:r>
+    </w:p>
+    <w:p>
+      <w:pPr>
+        <w:spacing w:after="20"/>
+        <w:ind w:left="227" w:hanging="142"/>
+      </w:pPr>
+      <w:r>
+        <w:rPr>
+          <w:rFonts w:eastAsia="宋体"/>
+          <w:rFonts w:ascii="宋体" w:hAnsi="宋体"/>
+          <w:b w:val="0"/>
+          <w:sz w:val="19"/>
+        </w:rPr>
+        <w:t>• 部署至 Render 平台实现公网访问，项目已开源（95+ 文件、38 个单元测试）。</w:t>
       </w:r>
     </w:p>
     <w:p>

</xml_diff>

<commit_message>
docs: update campus experience and add Office skills
</commit_message>
<xml_diff>
--- a/简历/张宇辰_求职简历_智能客服Agent.docx
+++ b/简历/张宇辰_求职简历_智能客服Agent.docx
@@ -172,7 +172,7 @@
           <w:b w:val="0"/>
           <w:sz w:val="19"/>
         </w:rPr>
-        <w:t>• 工具与部署：了解 FastAPI 基础、Git 版本控制、Docker 容器化部署；熟练使用 Claude Code 等 AI 工具进行辅助开发。</w:t>
+        <w:t>• 工具与部署：熟练使用 Office 办公软件；了解 FastAPI 基础、Git 版本控制、Docker 容器化部署；熟练使用 Claude Code 等 AI 工具进行辅助开发。</w:t>
       </w:r>
     </w:p>
     <w:p>
@@ -390,7 +390,7 @@
           <w:b w:val="0"/>
           <w:sz w:val="19"/>
         </w:rPr>
-        <w:t>• 统筹全院党团关系排查，建立"通知下发-进度催收-审核归档"跟进机制，确保信息收集零遗漏；负责数据规范化整理与跨层级沟通答疑。</w:t>
+        <w:t>• 负责对接各班级团支书，询问并统计各班入党、入团情况，收集信息整理成表格，确保数据准确、按时汇总上报。</w:t>
       </w:r>
     </w:p>
     <w:p>

</xml_diff>

<commit_message>
docs: tone down Office skills, polish campus experience
</commit_message>
<xml_diff>
--- a/简历/张宇辰_求职简历_智能客服Agent.docx
+++ b/简历/张宇辰_求职简历_智能客服Agent.docx
@@ -172,7 +172,7 @@
           <w:b w:val="0"/>
           <w:sz w:val="19"/>
         </w:rPr>
-        <w:t>• 工具与部署：熟练使用 Office 办公软件；了解 FastAPI 基础、Git 版本控制、Docker 容器化部署；熟练使用 Claude Code 等 AI 工具进行辅助开发。</w:t>
+        <w:t>• 工具与部署：有 Office 办公软件使用经验；了解 FastAPI 基础、Git 版本控制、Docker 容器化部署；熟练使用 Claude Code 等 AI 工具进行辅助开发。</w:t>
       </w:r>
     </w:p>
     <w:p>
@@ -390,7 +390,7 @@
           <w:b w:val="0"/>
           <w:sz w:val="19"/>
         </w:rPr>
-        <w:t>• 负责对接各班级团支书，询问并统计各班入党、入团情况，收集信息整理成表格，确保数据准确、按时汇总上报。</w:t>
+        <w:t>• 对接全院各班级团支书，定期跟进入党入团情况摸排，将收集的信息整理归档并汇总成表，确保材料规范、按时上报。</w:t>
       </w:r>
     </w:p>
     <w:p>

</xml_diff>

<commit_message>
docs: add WeChat article editing experience
</commit_message>
<xml_diff>
--- a/简历/张宇辰_求职简历_智能客服Agent.docx
+++ b/简历/张宇辰_求职简历_智能客服Agent.docx
@@ -395,6 +395,21 @@
     </w:p>
     <w:p>
       <w:pPr>
+        <w:spacing w:after="20"/>
+        <w:ind w:left="227" w:hanging="142"/>
+      </w:pPr>
+      <w:r>
+        <w:rPr>
+          <w:rFonts w:eastAsia="宋体"/>
+          <w:rFonts w:ascii="宋体" w:hAnsi="宋体"/>
+          <w:b w:val="0"/>
+          <w:sz w:val="19"/>
+        </w:rPr>
+        <w:t>• 参与微信公众号"团干培训"相关推文的图文编辑与排版，积累了一定的新媒体内容制作经验。</w:t>
+      </w:r>
+    </w:p>
+    <w:p>
+      <w:pPr>
         <w:spacing w:before="160" w:after="40"/>
         <w:pBdr>
           <w:bottom w:val="single" w:sz="4" w:space="1" w:color="2E75B6"/>

</xml_diff>

<commit_message>
docs: add personal photo to resume header
</commit_message>
<xml_diff>
--- a/简历/张宇辰_求职简历_智能客服Agent.docx
+++ b/简历/张宇辰_求职简历_智能客服Agent.docx
@@ -2,53 +2,122 @@
 <file path=word/document.xml><?xml version="1.0" encoding="utf-8"?>
 <w:document xmlns:wpc="http://schemas.microsoft.com/office/word/2010/wordprocessingCanvas" xmlns:mo="http://schemas.microsoft.com/office/mac/office/2008/main" xmlns:mc="http://schemas.openxmlformats.org/markup-compatibility/2006" xmlns:mv="urn:schemas-microsoft-com:mac:vml" xmlns:o="urn:schemas-microsoft-com:office:office" xmlns:r="http://schemas.openxmlformats.org/officeDocument/2006/relationships" xmlns:m="http://schemas.openxmlformats.org/officeDocument/2006/math" xmlns:v="urn:schemas-microsoft-com:vml" xmlns:wp14="http://schemas.microsoft.com/office/word/2010/wordprocessingDrawing" xmlns:wp="http://schemas.openxmlformats.org/drawingml/2006/wordprocessingDrawing" xmlns:w10="urn:schemas-microsoft-com:office:word" xmlns:w="http://schemas.openxmlformats.org/wordprocessingml/2006/main" xmlns:w14="http://schemas.microsoft.com/office/word/2010/wordml" xmlns:wpg="http://schemas.microsoft.com/office/word/2010/wordprocessingGroup" xmlns:wpi="http://schemas.microsoft.com/office/word/2010/wordprocessingInk" xmlns:wne="http://schemas.microsoft.com/office/word/2006/wordml" xmlns:wps="http://schemas.microsoft.com/office/word/2010/wordprocessingShape" mc:Ignorable="w14 wp14">
   <w:body>
-    <w:p>
-      <w:pPr>
-        <w:spacing w:after="40"/>
+    <w:tbl>
+      <w:tblPr>
+        <w:tblW w:type="auto" w:w="0"/>
         <w:jc w:val="center"/>
-      </w:pPr>
-      <w:r>
-        <w:rPr>
-          <w:rFonts w:eastAsia="黑体"/>
-          <w:rFonts w:ascii="黑体" w:hAnsi="黑体"/>
-          <w:b/>
-          <w:sz w:val="40"/>
-        </w:rPr>
-        <w:t>张 宇 辰</w:t>
-      </w:r>
-    </w:p>
-    <w:p>
-      <w:pPr>
-        <w:spacing w:after="20"/>
-        <w:jc w:val="center"/>
-      </w:pPr>
-      <w:r>
-        <w:rPr>
-          <w:rFonts w:eastAsia="宋体"/>
-          <w:rFonts w:ascii="宋体" w:hAnsi="宋体"/>
-          <w:b w:val="0"/>
-          <w:color w:val="555555"/>
-          <w:sz w:val="18"/>
-        </w:rPr>
-        <w:t>电话：138-xxxx-6789  |  邮箱：zhangyuchen@example.com  |  现居：广东省深圳市</w:t>
-      </w:r>
-    </w:p>
-    <w:p>
-      <w:pPr>
-        <w:spacing w:after="20"/>
-        <w:jc w:val="center"/>
-      </w:pPr>
-      <w:r>
-        <w:rPr>
-          <w:rFonts w:eastAsia="宋体"/>
-          <w:rFonts w:ascii="宋体" w:hAnsi="宋体"/>
-          <w:b w:val="0"/>
-          <w:color w:val="555555"/>
-          <w:sz w:val="18"/>
-        </w:rPr>
-        <w:t>江西财经大学 · 软件工程 · 本科（2027届）  |  GitHub：github.com/HoshinoYuto123</w:t>
-      </w:r>
-    </w:p>
+        <w:tblLook w:firstColumn="1" w:firstRow="1" w:lastColumn="0" w:lastRow="0" w:noHBand="0" w:noVBand="1" w:val="04A0"/>
+      </w:tblPr>
+      <w:tblGrid>
+        <w:gridCol w:w="5103"/>
+        <w:gridCol w:w="5103"/>
+      </w:tblGrid>
+      <w:tr>
+        <w:tc>
+          <w:tcPr>
+            <w:tcW w:type="dxa" w:w="6803"/>
+            <w:tcBorders>
+              <w:top w:val="none" w:sz="0" w:space="0"/>
+              <w:left w:val="none" w:sz="0" w:space="0"/>
+              <w:bottom w:val="none" w:sz="0" w:space="0"/>
+              <w:right w:val="none" w:sz="0" w:space="0"/>
+            </w:tcBorders>
+          </w:tcPr>
+          <w:p>
+            <w:pPr>
+              <w:spacing w:after="40"/>
+              <w:jc w:val="left"/>
+            </w:pPr>
+            <w:r>
+              <w:rPr>
+                <w:rFonts w:eastAsia="黑体"/>
+                <w:rFonts w:ascii="黑体" w:hAnsi="黑体"/>
+                <w:b/>
+                <w:sz w:val="40"/>
+              </w:rPr>
+              <w:t>张 宇 辰</w:t>
+            </w:r>
+          </w:p>
+          <w:p>
+            <w:pPr>
+              <w:spacing w:after="20"/>
+            </w:pPr>
+            <w:r>
+              <w:rPr>
+                <w:rFonts w:eastAsia="宋体"/>
+                <w:rFonts w:ascii="宋体" w:hAnsi="宋体"/>
+                <w:b w:val="0"/>
+                <w:color w:val="555555"/>
+                <w:sz w:val="18"/>
+              </w:rPr>
+              <w:t>电话：138-xxxx-6789  |  邮箱：zhangyuchen@example.com  |  现居：广东省深圳市</w:t>
+            </w:r>
+          </w:p>
+          <w:p>
+            <w:r>
+              <w:rPr>
+                <w:rFonts w:eastAsia="宋体"/>
+                <w:rFonts w:ascii="宋体" w:hAnsi="宋体"/>
+                <w:b w:val="0"/>
+                <w:color w:val="555555"/>
+                <w:sz w:val="18"/>
+              </w:rPr>
+              <w:t>江西财经大学 · 软件工程 · 本科（2027届）  |  GitHub：github.com/HoshinoYuto123</w:t>
+            </w:r>
+          </w:p>
+        </w:tc>
+        <w:tc>
+          <w:tcPr>
+            <w:tcW w:type="dxa" w:w="2551"/>
+            <w:tcBorders>
+              <w:top w:val="none" w:sz="0" w:space="0"/>
+              <w:left w:val="none" w:sz="0" w:space="0"/>
+              <w:bottom w:val="none" w:sz="0" w:space="0"/>
+              <w:right w:val="none" w:sz="0" w:space="0"/>
+            </w:tcBorders>
+          </w:tcPr>
+          <w:p>
+            <w:pPr>
+              <w:jc w:val="right"/>
+            </w:pPr>
+            <w:r>
+              <w:drawing>
+                <wp:inline xmlns:a="http://schemas.openxmlformats.org/drawingml/2006/main" xmlns:pic="http://schemas.openxmlformats.org/drawingml/2006/picture">
+                  <wp:extent cx="1005840" cy="1325880"/>
+                  <wp:docPr id="1" name="Picture 1"/>
+                  <wp:cNvGraphicFramePr>
+                    <a:graphicFrameLocks noChangeAspect="1"/>
+                  </wp:cNvGraphicFramePr>
+                  <a:graphic>
+                    <a:graphicData uri="http://schemas.openxmlformats.org/drawingml/2006/picture">
+                      <pic:pic>
+                        <pic:nvPicPr>
+                          <pic:cNvPr id="0" name="photo.jpg"/>
+                          <pic:cNvPicPr/>
+                        </pic:nvPicPr>
+                        <pic:blipFill>
+                          <a:blip r:embed="rId9"/>
+                          <a:stretch>
+                            <a:fillRect/>
+                          </a:stretch>
+                        </pic:blipFill>
+                        <pic:spPr>
+                          <a:xfrm>
+                            <a:off x="0" y="0"/>
+                            <a:ext cx="1005840" cy="1325880"/>
+                          </a:xfrm>
+                          <a:prstGeom prst="rect"/>
+                        </pic:spPr>
+                      </pic:pic>
+                    </a:graphicData>
+                  </a:graphic>
+                </wp:inline>
+              </w:drawing>
+            </w:r>
+          </w:p>
+        </w:tc>
+      </w:tr>
+    </w:tbl>
     <w:p>
       <w:pPr>
         <w:spacing w:before="160" w:after="40"/>

</xml_diff>

<commit_message>
docs: add Prompt Engineering and Function Calling to resume
</commit_message>
<xml_diff>
--- a/简历/张宇辰_求职简历_智能客服Agent.docx
+++ b/简历/张宇辰_求职简历_智能客服Agent.docx
@@ -211,7 +211,7 @@
           <w:b w:val="0"/>
           <w:sz w:val="19"/>
         </w:rPr>
-        <w:t>• AI 应用：了解 LangChain / LangGraph 框架基础概念，理解 Agent 多节点状态机工作流程。</w:t>
+        <w:t>• AI 应用：了解 LangChain / LangGraph 框架基础，理解 Agent 多节点状态机工作流程；了解 Prompt Engineering 与 Function Calling 工具调用机制。</w:t>
       </w:r>
     </w:p>
     <w:p>
@@ -318,7 +318,7 @@
           <w:b w:val="0"/>
           <w:sz w:val="19"/>
         </w:rPr>
-        <w:t>• 基于 LangChain / LangGraph 框架搭建多节点 Agent 状态机（澄清 → 路由 → 检索执行 → 回复 → 降级），实现多轮对话、反问澄清与工具调用。</w:t>
+        <w:t>• 基于 LangChain / LangGraph 框架搭建多节点 Agent 状态机（澄清 → 路由 → 检索执行 → 回复 → 降级），通过 Prompt 工程引导大模型行为，结合 Function Calling 实现工具调用。</w:t>
       </w:r>
     </w:p>
     <w:p>

</xml_diff>